<commit_message>
feat: clean up code
</commit_message>
<xml_diff>
--- a/document/DeCuongTieuLuan_DoanQuocDang_checked 20012025.docx
+++ b/document/DeCuongTieuLuan_DoanQuocDang_checked 20012025.docx
@@ -166,7 +166,7 @@
                     </wp:anchor>
                   </w:drawing>
                 </mc:Choice>
-                <mc:Fallback xmlns:w16sdtfl="http://schemas.microsoft.com/office/word/2024/wordml/sdtformatlock" xmlns:w16du="http://schemas.microsoft.com/office/word/2023/wordml/word16du">
+                <mc:Fallback xmlns:w16du="http://schemas.microsoft.com/office/word/2023/wordml/word16du" xmlns:w16sdtfl="http://schemas.microsoft.com/office/word/2024/wordml/sdtformatlock">
                   <w:pict>
                     <v:line w14:anchorId="5F644ED4" id="Line 4" o:spid="_x0000_s1026" style="position:absolute;z-index:251657216;visibility:visible;mso-wrap-style:square;mso-width-percent:0;mso-height-percent:0;mso-wrap-distance-left:9pt;mso-wrap-distance-top:-3e-5mm;mso-wrap-distance-right:9pt;mso-wrap-distance-bottom:-3e-5mm;mso-position-horizontal:absolute;mso-position-horizontal-relative:text;mso-position-vertical:absolute;mso-position-vertical-relative:text;mso-width-percent:0;mso-height-percent:0;mso-width-relative:page;mso-height-relative:page" from="69.45pt,2.65pt" to="180.75pt,2.65pt" o:gfxdata="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"/>
                   </w:pict>
@@ -262,7 +262,7 @@
                     </wp:anchor>
                   </w:drawing>
                 </mc:Choice>
-                <mc:Fallback xmlns:w16sdtfl="http://schemas.microsoft.com/office/word/2024/wordml/sdtformatlock" xmlns:w16du="http://schemas.microsoft.com/office/word/2023/wordml/word16du">
+                <mc:Fallback xmlns:w16du="http://schemas.microsoft.com/office/word/2023/wordml/word16du" xmlns:w16sdtfl="http://schemas.microsoft.com/office/word/2024/wordml/sdtformatlock">
                   <w:pict>
                     <v:line w14:anchorId="330D1A25" id="Line 7" o:spid="_x0000_s1026" style="position:absolute;z-index:251658240;visibility:visible;mso-wrap-style:square;mso-width-percent:0;mso-height-percent:0;mso-wrap-distance-left:9pt;mso-wrap-distance-top:-3e-5mm;mso-wrap-distance-right:9pt;mso-wrap-distance-bottom:-3e-5mm;mso-position-horizontal:absolute;mso-position-horizontal-relative:text;mso-position-vertical:absolute;mso-position-vertical-relative:text;mso-width-percent:0;mso-height-percent:0;mso-width-relative:page;mso-height-relative:page" from="86.1pt,32.25pt" to="179.85pt,32.25pt" o:gfxdata="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"/>
                   </w:pict>
@@ -1734,7 +1734,27 @@
           <w:szCs w:val="26"/>
           <w:lang w:eastAsia="ja-JP"/>
         </w:rPr>
-        <w:t xml:space="preserve"> lịch sử và sở thích nghe nhạc của người dùng</w:t>
+        <w:t xml:space="preserve"> lịch sử </w:t>
+      </w:r>
+      <w:r>
+        <w:rPr>
+          <w:rFonts w:ascii="Times New Roman" w:hAnsi="Times New Roman"/>
+          <w:bCs/>
+          <w:sz w:val="26"/>
+          <w:szCs w:val="26"/>
+          <w:lang w:eastAsia="ja-JP"/>
+        </w:rPr>
+        <w:t xml:space="preserve">đọc truyện </w:t>
+      </w:r>
+      <w:r>
+        <w:rPr>
+          <w:rFonts w:ascii="Times New Roman" w:hAnsi="Times New Roman"/>
+          <w:bCs/>
+          <w:sz w:val="26"/>
+          <w:szCs w:val="26"/>
+          <w:lang w:eastAsia="ja-JP"/>
+        </w:rPr>
+        <w:t>của người dùng</w:t>
       </w:r>
       <w:r>
         <w:rPr>

</xml_diff>